<commit_message>
Exp-5: add 5.5-5.7 Word2Vec CBOW, Skip-Gram and cosine similarity
</commit_message>
<xml_diff>
--- a/CNLP Exp-5/Experiment-5.docx
+++ b/CNLP Exp-5/Experiment-5.docx
@@ -397,6 +397,528 @@
         <w:rPr>
           <w:rtl w:val="0"/>
         </w:rPr>
+      </w:r>
+    </w:p>
+    <w:p>
+      <w:pPr>
+        <w:rPr/>
+      </w:pPr>
+      <w:r>
+        <w:rPr>
+          <w:rtl w:val="0"/>
+        </w:rPr>
+        <w:t xml:space="preserve">     </w:t>
+      </w:r>
+    </w:p>
+    <w:p>
+      <w:pPr>
+        <w:rPr/>
+      </w:pPr>
+      <w:r>
+        <w:rPr>
+          <w:rtl w:val="0"/>
+        </w:rPr>
+      </w:r>
+    </w:p>
+    <w:p>
+      <w:pPr>
+        <w:rPr/>
+      </w:pPr>
+      <w:r>
+        <w:rPr>
+          <w:rtl w:val="0"/>
+        </w:rPr>
+      </w:r>
+    </w:p>
+    <w:p>
+      <w:pPr>
+        <w:rPr/>
+      </w:pPr>
+      <w:r>
+        <w:rPr>
+          <w:rtl w:val="0"/>
+        </w:rPr>
+      </w:r>
+    </w:p>
+    <w:p>
+      <w:pPr>
+        <w:rPr/>
+      </w:pPr>
+      <w:r>
+        <w:rPr>
+          <w:rtl w:val="0"/>
+        </w:rPr>
+      </w:r>
+    </w:p>
+    <w:p>
+      <w:pPr>
+        <w:rPr/>
+      </w:pPr>
+      <w:r>
+        <w:rPr>
+          <w:rtl w:val="0"/>
+        </w:rPr>
+      </w:r>
+    </w:p>
+    <w:p>
+      <w:pPr>
+        <w:rPr/>
+      </w:pPr>
+      <w:r>
+        <w:rPr>
+          <w:rtl w:val="0"/>
+        </w:rPr>
+      </w:r>
+    </w:p>
+    <w:p>
+      <w:pPr>
+        <w:rPr/>
+      </w:pPr>
+      <w:r>
+        <w:rPr>
+          <w:rtl w:val="0"/>
+        </w:rPr>
+        <w:t xml:space="preserve">5.5 Write a Python program to train a Word2Vec CBOW model using the given text corpus. Display the vector representation of a selected word and find the three most similar words.</w:t>
+      </w:r>
+    </w:p>
+    <w:p>
+      <w:pPr>
+        <w:pStyle w:val="Heading3"/>
+        <w:keepNext w:val="0"/>
+        <w:keepLines w:val="0"/>
+        <w:spacing w:before="280" w:lineRule="auto"/>
+        <w:rPr>
+          <w:b w:val="1"/>
+          <w:bCs w:val="1"/>
+          <w:color w:val="000000"/>
+          <w:sz w:val="26"/>
+          <w:szCs w:val="26"/>
+        </w:rPr>
+      </w:pPr>
+      <w:bookmarkStart w:colFirst="0" w:colLast="0" w:name="_snzcrj6n1urt" w:id="0"/>
+      <w:bookmarkEnd w:id="0"/>
+      <w:r>
+        <w:rPr>
+          <w:b w:val="1"/>
+          <w:bCs w:val="1"/>
+          <w:color w:val="000000"/>
+          <w:sz w:val="26"/>
+          <w:szCs w:val="26"/>
+          <w:rtl w:val="0"/>
+        </w:rPr>
+        <w:t xml:space="preserve">Input corpus</w:t>
+      </w:r>
+    </w:p>
+    <w:p>
+      <w:pPr>
+        <w:spacing w:after="240" w:before="240" w:lineRule="auto"/>
+        <w:rPr/>
+      </w:pPr>
+      <w:r>
+        <w:rPr>
+          <w:rtl w:val="0"/>
+        </w:rPr>
+        <w:t xml:space="preserve">Create a file named </w:t>
+      </w:r>
+      <w:r>
+        <w:rPr>
+          <w:rFonts w:ascii="Roboto Mono" w:cs="Roboto Mono" w:eastAsia="Roboto Mono" w:hAnsi="Roboto Mono"/>
+          <w:rtl w:val="0"/>
+        </w:rPr>
+        <w:t xml:space="preserve">corpus.txt</w:t>
+      </w:r>
+      <w:r>
+        <w:rPr>
+          <w:rtl w:val="0"/>
+        </w:rPr>
+        <w:t xml:space="preserve">:</w:t>
+      </w:r>
+    </w:p>
+    <w:p>
+      <w:pPr>
+        <w:rPr/>
+      </w:pPr>
+      <w:r>
+        <w:rPr>
+          <w:rtl w:val="0"/>
+        </w:rPr>
+        <w:t xml:space="preserve">Natural language processing is interesting</w:t>
+      </w:r>
+    </w:p>
+    <w:p>
+      <w:pPr>
+        <w:rPr/>
+      </w:pPr>
+      <w:r>
+        <w:rPr>
+          <w:rtl w:val="0"/>
+        </w:rPr>
+        <w:t xml:space="preserve">Natural language processing is useful</w:t>
+      </w:r>
+    </w:p>
+    <w:p>
+      <w:pPr>
+        <w:rPr/>
+      </w:pPr>
+      <w:r>
+        <w:rPr>
+          <w:rtl w:val="0"/>
+        </w:rPr>
+        <w:t xml:space="preserve">I love machine learning</w:t>
+      </w:r>
+    </w:p>
+    <w:p>
+      <w:pPr>
+        <w:rPr/>
+      </w:pPr>
+      <w:r>
+        <w:rPr>
+          <w:rtl w:val="0"/>
+        </w:rPr>
+        <w:t xml:space="preserve">Machine learning is useful</w:t>
+      </w:r>
+    </w:p>
+    <w:p>
+      <w:pPr>
+        <w:rPr/>
+      </w:pPr>
+      <w:r>
+        <w:rPr>
+          <w:rtl w:val="0"/>
+        </w:rPr>
+        <w:t xml:space="preserve">Deep learning is a part of machine learning</w:t>
+      </w:r>
+    </w:p>
+    <w:p>
+      <w:pPr>
+        <w:rPr/>
+      </w:pPr>
+      <w:r>
+        <w:rPr>
+          <w:rtl w:val="0"/>
+        </w:rPr>
+        <w:t xml:space="preserve">Artificial intelligence is changing the world</w:t>
+      </w:r>
+    </w:p>
+    <w:p>
+      <w:pPr>
+        <w:rPr/>
+      </w:pPr>
+      <w:r>
+        <w:rPr>
+          <w:rtl w:val="0"/>
+        </w:rPr>
+        <w:t xml:space="preserve">Natural language processing uses machine learning</w:t>
+      </w:r>
+    </w:p>
+    <w:p>
+      <w:pPr>
+        <w:rPr/>
+      </w:pPr>
+      <w:r>
+        <w:rPr>
+          <w:rtl w:val="0"/>
+        </w:rPr>
+        <w:t xml:space="preserve">Deep learning and artificial intelligence are related</w:t>
+      </w:r>
+    </w:p>
+    <w:p>
+      <w:pPr>
+        <w:rPr/>
+      </w:pPr>
+      <w:r>
+        <w:rPr>
+          <w:rtl w:val="0"/>
+        </w:rPr>
+        <w:t xml:space="preserve">I study natural language processing</w:t>
+      </w:r>
+    </w:p>
+    <w:p>
+      <w:pPr>
+        <w:rPr/>
+      </w:pPr>
+      <w:r>
+        <w:rPr>
+          <w:rtl w:val="0"/>
+        </w:rPr>
+        <w:t xml:space="preserve">Machine learning helps artificial intelligence</w:t>
+      </w:r>
+    </w:p>
+    <w:p>
+      <w:pPr>
+        <w:rPr/>
+      </w:pPr>
+      <w:r>
+        <w:rPr>
+          <w:rtl w:val="0"/>
+        </w:rPr>
+      </w:r>
+    </w:p>
+    <w:p>
+      <w:pPr>
+        <w:rPr/>
+      </w:pPr>
+      <w:r>
+        <w:rPr>
+          <w:rtl w:val="0"/>
+        </w:rPr>
+      </w:r>
+    </w:p>
+    <w:p>
+      <w:pPr>
+        <w:spacing w:after="240" w:before="240" w:lineRule="auto"/>
+        <w:ind w:left="0" w:firstLine="0"/>
+        <w:rPr/>
+      </w:pPr>
+      <w:r>
+        <w:rPr>
+          <w:rtl w:val="0"/>
+        </w:rPr>
+        <w:t xml:space="preserve">5.6 Write a Python program to train a Skip-Gram Word2Vec model using the same corpus. Retrieve the vector for </w:t>
+      </w:r>
+      <w:r>
+        <w:rPr>
+          <w:rFonts w:ascii="Roboto Mono" w:cs="Roboto Mono" w:eastAsia="Roboto Mono" w:hAnsi="Roboto Mono"/>
+          <w:rtl w:val="0"/>
+        </w:rPr>
+        <w:t xml:space="preserve">"language"</w:t>
+      </w:r>
+      <w:r>
+        <w:rPr>
+          <w:rtl w:val="0"/>
+        </w:rPr>
+        <w:t xml:space="preserve"> and display the five most similar words.</w:t>
+      </w:r>
+    </w:p>
+    <w:p>
+      <w:pPr>
+        <w:pStyle w:val="Heading3"/>
+        <w:keepNext w:val="0"/>
+        <w:keepLines w:val="0"/>
+        <w:spacing w:before="280" w:lineRule="auto"/>
+        <w:rPr>
+          <w:color w:val="000000"/>
+        </w:rPr>
+      </w:pPr>
+      <w:bookmarkStart w:colFirst="0" w:colLast="0" w:name="_82h6z5res8jy" w:id="1"/>
+      <w:bookmarkEnd w:id="1"/>
+      <w:r>
+        <w:rPr>
+          <w:b w:val="1"/>
+          <w:bCs w:val="1"/>
+          <w:color w:val="000000"/>
+          <w:sz w:val="26"/>
+          <w:szCs w:val="26"/>
+          <w:rtl w:val="0"/>
+        </w:rPr>
+        <w:t xml:space="preserve">Input corpus </w:t>
+      </w:r>
+      <w:r>
+        <w:rPr>
+          <w:color w:val="000000"/>
+          <w:rtl w:val="0"/>
+        </w:rPr>
+        <w:t xml:space="preserve">Use </w:t>
+      </w:r>
+      <w:r>
+        <w:rPr>
+          <w:rFonts w:ascii="Roboto Mono" w:cs="Roboto Mono" w:eastAsia="Roboto Mono" w:hAnsi="Roboto Mono"/>
+          <w:color w:val="000000"/>
+          <w:rtl w:val="0"/>
+        </w:rPr>
+        <w:t xml:space="preserve">corpus.txt</w:t>
+      </w:r>
+      <w:r>
+        <w:rPr>
+          <w:color w:val="000000"/>
+          <w:rtl w:val="0"/>
+        </w:rPr>
+        <w:t xml:space="preserve"> from Question 5.5.</w:t>
+      </w:r>
+    </w:p>
+    <w:p>
+      <w:pPr>
+        <w:ind w:left="720" w:firstLine="0"/>
+        <w:rPr/>
+      </w:pPr>
+      <w:r>
+        <w:rPr>
+          <w:rtl w:val="0"/>
+        </w:rPr>
+      </w:r>
+    </w:p>
+    <w:p>
+      <w:pPr>
+        <w:spacing w:after="240" w:before="240" w:lineRule="auto"/>
+        <w:ind w:left="0" w:firstLine="0"/>
+        <w:rPr/>
+      </w:pPr>
+      <w:r>
+        <w:rPr>
+          <w:rtl w:val="0"/>
+        </w:rPr>
+        <w:t xml:space="preserve">5.7 Train a Word2Vec model using the provided corpus and calculate the cosine similarity between selected word pairs.</w:t>
+      </w:r>
+    </w:p>
+    <w:p>
+      <w:pPr>
+        <w:pStyle w:val="Heading3"/>
+        <w:keepNext w:val="0"/>
+        <w:keepLines w:val="0"/>
+        <w:spacing w:before="280" w:lineRule="auto"/>
+        <w:ind w:left="720" w:hanging="360"/>
+        <w:rPr>
+          <w:b w:val="1"/>
+          <w:bCs w:val="1"/>
+          <w:color w:val="000000"/>
+          <w:sz w:val="26"/>
+          <w:szCs w:val="26"/>
+        </w:rPr>
+      </w:pPr>
+      <w:bookmarkStart w:colFirst="0" w:colLast="0" w:name="_1z5rlek088y3" w:id="2"/>
+      <w:bookmarkEnd w:id="2"/>
+      <w:r>
+        <w:rPr>
+          <w:b w:val="1"/>
+          <w:bCs w:val="1"/>
+          <w:color w:val="000000"/>
+          <w:sz w:val="26"/>
+          <w:szCs w:val="26"/>
+          <w:rtl w:val="0"/>
+        </w:rPr>
+        <w:t xml:space="preserve">Input corpus: </w:t>
+      </w:r>
+      <w:r>
+        <w:rPr>
+          <w:color w:val="000000"/>
+          <w:rtl w:val="0"/>
+        </w:rPr>
+        <w:t xml:space="preserve">Use </w:t>
+      </w:r>
+      <w:r>
+        <w:rPr>
+          <w:rFonts w:ascii="Roboto Mono" w:cs="Roboto Mono" w:eastAsia="Roboto Mono" w:hAnsi="Roboto Mono"/>
+          <w:color w:val="000000"/>
+          <w:rtl w:val="0"/>
+        </w:rPr>
+        <w:t xml:space="preserve">corpus.txt</w:t>
+      </w:r>
+      <w:r>
+        <w:rPr>
+          <w:color w:val="000000"/>
+          <w:rtl w:val="0"/>
+        </w:rPr>
+        <w:t xml:space="preserve"> from Question 5.5.</w:t>
+      </w:r>
+      <w:r>
+        <w:rPr>
+          <w:rtl w:val="0"/>
+        </w:rPr>
+      </w:r>
+    </w:p>
+    <w:p>
+      <w:pPr>
+        <w:spacing w:after="240" w:before="240" w:lineRule="auto"/>
+        <w:rPr/>
+      </w:pPr>
+      <w:r>
+        <w:rPr>
+          <w:rtl w:val="0"/>
+        </w:rPr>
+        <w:t xml:space="preserve">Calculate similarity for:</w:t>
+      </w:r>
+    </w:p>
+    <w:p>
+      <w:pPr>
+        <w:numPr>
+          <w:ilvl w:val="0"/>
+          <w:numId w:val="3"/>
+        </w:numPr>
+        <w:spacing w:after="0" w:afterAutospacing="0" w:before="240" w:lineRule="auto"/>
+        <w:ind w:left="720" w:hanging="360"/>
+        <w:rPr/>
+      </w:pPr>
+      <w:r>
+        <w:rPr>
+          <w:rFonts w:ascii="Roboto Mono" w:cs="Roboto Mono" w:eastAsia="Roboto Mono" w:hAnsi="Roboto Mono"/>
+          <w:rtl w:val="0"/>
+        </w:rPr>
+        <w:t xml:space="preserve">machine</w:t>
+      </w:r>
+      <w:r>
+        <w:rPr>
+          <w:rtl w:val="0"/>
+        </w:rPr>
+        <w:t xml:space="preserve"> and </w:t>
+      </w:r>
+      <w:r>
+        <w:rPr>
+          <w:rFonts w:ascii="Roboto Mono" w:cs="Roboto Mono" w:eastAsia="Roboto Mono" w:hAnsi="Roboto Mono"/>
+          <w:rtl w:val="0"/>
+        </w:rPr>
+        <w:t xml:space="preserve">learning</w:t>
+      </w:r>
+    </w:p>
+    <w:p>
+      <w:pPr>
+        <w:numPr>
+          <w:ilvl w:val="0"/>
+          <w:numId w:val="3"/>
+        </w:numPr>
+        <w:spacing w:after="0" w:afterAutospacing="0" w:before="0" w:beforeAutospacing="0" w:lineRule="auto"/>
+        <w:ind w:left="720" w:hanging="360"/>
+        <w:rPr/>
+      </w:pPr>
+      <w:r>
+        <w:rPr>
+          <w:rFonts w:ascii="Roboto Mono" w:cs="Roboto Mono" w:eastAsia="Roboto Mono" w:hAnsi="Roboto Mono"/>
+          <w:rtl w:val="0"/>
+        </w:rPr>
+        <w:t xml:space="preserve">natural</w:t>
+      </w:r>
+      <w:r>
+        <w:rPr>
+          <w:rtl w:val="0"/>
+        </w:rPr>
+        <w:t xml:space="preserve"> and </w:t>
+      </w:r>
+      <w:r>
+        <w:rPr>
+          <w:rFonts w:ascii="Roboto Mono" w:cs="Roboto Mono" w:eastAsia="Roboto Mono" w:hAnsi="Roboto Mono"/>
+          <w:rtl w:val="0"/>
+        </w:rPr>
+        <w:t xml:space="preserve">language</w:t>
+      </w:r>
+    </w:p>
+    <w:p>
+      <w:pPr>
+        <w:numPr>
+          <w:ilvl w:val="0"/>
+          <w:numId w:val="3"/>
+        </w:numPr>
+        <w:spacing w:after="240" w:before="0" w:beforeAutospacing="0" w:lineRule="auto"/>
+        <w:ind w:left="720" w:hanging="360"/>
+        <w:rPr/>
+      </w:pPr>
+      <w:r>
+        <w:rPr>
+          <w:rFonts w:ascii="Roboto Mono" w:cs="Roboto Mono" w:eastAsia="Roboto Mono" w:hAnsi="Roboto Mono"/>
+          <w:rtl w:val="0"/>
+        </w:rPr>
+        <w:t xml:space="preserve">deep</w:t>
+      </w:r>
+      <w:r>
+        <w:rPr>
+          <w:rtl w:val="0"/>
+        </w:rPr>
+        <w:t xml:space="preserve"> and </w:t>
+      </w:r>
+      <w:r>
+        <w:rPr>
+          <w:rFonts w:ascii="Roboto Mono" w:cs="Roboto Mono" w:eastAsia="Roboto Mono" w:hAnsi="Roboto Mono"/>
+          <w:rtl w:val="0"/>
+        </w:rPr>
+        <w:t xml:space="preserve">learning</w:t>
       </w:r>
     </w:p>
     <w:p>
@@ -439,7 +961,7 @@
         <w:szCs w:val="24"/>
         <w:rtl w:val="0"/>
       </w:rPr>
-      <w:t xml:space="preserve">Experiment-5: Subword Level Tokenization and POS Tagging</w:t>
+      <w:t xml:space="preserve">Experiment-5: Subword Level Tokenization, POS Tagging and Word2Vec</w:t>
     </w:r>
   </w:p>
 </w:hdr>
@@ -667,11 +1189,124 @@
       </w:rPr>
     </w:lvl>
   </w:abstractNum>
+  <w:abstractNum w:abstractNumId="3">
+    <w:lvl w:ilvl="0">
+      <w:start w:val="1"/>
+      <w:numFmt w:val="decimal"/>
+      <w:lvlText w:val="%1."/>
+      <w:lvlJc w:val="left"/>
+      <w:pPr>
+        <w:ind w:left="720" w:hanging="360"/>
+      </w:pPr>
+      <w:rPr>
+        <w:u w:val="none"/>
+      </w:rPr>
+    </w:lvl>
+    <w:lvl w:ilvl="1">
+      <w:start w:val="1"/>
+      <w:numFmt w:val="lowerLetter"/>
+      <w:lvlText w:val="%2."/>
+      <w:lvlJc w:val="left"/>
+      <w:pPr>
+        <w:ind w:left="1440" w:hanging="360"/>
+      </w:pPr>
+      <w:rPr>
+        <w:u w:val="none"/>
+      </w:rPr>
+    </w:lvl>
+    <w:lvl w:ilvl="2">
+      <w:start w:val="1"/>
+      <w:numFmt w:val="lowerRoman"/>
+      <w:lvlText w:val="%3."/>
+      <w:lvlJc w:val="left"/>
+      <w:pPr>
+        <w:ind w:left="2160" w:hanging="360"/>
+      </w:pPr>
+      <w:rPr>
+        <w:u w:val="none"/>
+      </w:rPr>
+    </w:lvl>
+    <w:lvl w:ilvl="3">
+      <w:start w:val="1"/>
+      <w:numFmt w:val="decimal"/>
+      <w:lvlText w:val="%4."/>
+      <w:lvlJc w:val="left"/>
+      <w:pPr>
+        <w:ind w:left="2880" w:hanging="360"/>
+      </w:pPr>
+      <w:rPr>
+        <w:u w:val="none"/>
+      </w:rPr>
+    </w:lvl>
+    <w:lvl w:ilvl="4">
+      <w:start w:val="1"/>
+      <w:numFmt w:val="lowerLetter"/>
+      <w:lvlText w:val="%5."/>
+      <w:lvlJc w:val="left"/>
+      <w:pPr>
+        <w:ind w:left="3600" w:hanging="360"/>
+      </w:pPr>
+      <w:rPr>
+        <w:u w:val="none"/>
+      </w:rPr>
+    </w:lvl>
+    <w:lvl w:ilvl="5">
+      <w:start w:val="1"/>
+      <w:numFmt w:val="lowerRoman"/>
+      <w:lvlText w:val="%6."/>
+      <w:lvlJc w:val="left"/>
+      <w:pPr>
+        <w:ind w:left="4320" w:hanging="360"/>
+      </w:pPr>
+      <w:rPr>
+        <w:u w:val="none"/>
+      </w:rPr>
+    </w:lvl>
+    <w:lvl w:ilvl="6">
+      <w:start w:val="1"/>
+      <w:numFmt w:val="decimal"/>
+      <w:lvlText w:val="%7."/>
+      <w:lvlJc w:val="left"/>
+      <w:pPr>
+        <w:ind w:left="5040" w:hanging="360"/>
+      </w:pPr>
+      <w:rPr>
+        <w:u w:val="none"/>
+      </w:rPr>
+    </w:lvl>
+    <w:lvl w:ilvl="7">
+      <w:start w:val="1"/>
+      <w:numFmt w:val="lowerLetter"/>
+      <w:lvlText w:val="%8."/>
+      <w:lvlJc w:val="left"/>
+      <w:pPr>
+        <w:ind w:left="5760" w:hanging="360"/>
+      </w:pPr>
+      <w:rPr>
+        <w:u w:val="none"/>
+      </w:rPr>
+    </w:lvl>
+    <w:lvl w:ilvl="8">
+      <w:start w:val="1"/>
+      <w:numFmt w:val="lowerRoman"/>
+      <w:lvlText w:val="%9."/>
+      <w:lvlJc w:val="left"/>
+      <w:pPr>
+        <w:ind w:left="6480" w:hanging="360"/>
+      </w:pPr>
+      <w:rPr>
+        <w:u w:val="none"/>
+      </w:rPr>
+    </w:lvl>
+  </w:abstractNum>
   <w:num w:numId="1">
     <w:abstractNumId w:val="1"/>
   </w:num>
   <w:num w:numId="2">
     <w:abstractNumId w:val="2"/>
+  </w:num>
+  <w:num w:numId="3">
+    <w:abstractNumId w:val="3"/>
   </w:num>
 </w:numbering>
 </file>

</xml_diff>